<commit_message>
docs: actualizar informe ejecutivo docx con Anexo D
</commit_message>
<xml_diff>
--- a/reports/informe_ejecutivo_P2.docx
+++ b/reports/informe_ejecutivo_P2.docx
@@ -673,7 +673,7 @@
     </w:p>
     <w:sdt>
       <w:sdtPr>
-        <w:id w:val="-786472288"/>
+        <w:id w:val="1417143341"/>
         <w:docPartObj>
           <w:docPartGallery w:val="Table of Contents"/>
           <w:docPartUnique w:val="1"/>
@@ -10847,12 +10847,12 @@
           <wp:inline distB="0" distT="0" distL="0" distR="0">
             <wp:extent cx="5612130" cy="2886075"/>
             <wp:effectExtent b="0" l="0" r="0" t="0"/>
-            <wp:docPr id="3" name="image19.png"/>
+            <wp:docPr id="3" name="image11.png"/>
             <a:graphic>
               <a:graphicData uri="http://schemas.openxmlformats.org/drawingml/2006/picture">
                 <pic:pic>
                   <pic:nvPicPr>
-                    <pic:cNvPr id="0" name="image19.png"/>
+                    <pic:cNvPr id="0" name="image11.png"/>
                     <pic:cNvPicPr preferRelativeResize="0"/>
                   </pic:nvPicPr>
                   <pic:blipFill>
@@ -10963,12 +10963,12 @@
           <wp:inline distB="0" distT="0" distL="0" distR="0">
             <wp:extent cx="4763099" cy="3591377"/>
             <wp:effectExtent b="0" l="0" r="0" t="0"/>
-            <wp:docPr descr="Dashboard vista 2" id="5" name="image1.jpg"/>
+            <wp:docPr descr="Dashboard vista 2" id="5" name="image3.jpg"/>
             <a:graphic>
               <a:graphicData uri="http://schemas.openxmlformats.org/drawingml/2006/picture">
                 <pic:pic>
                   <pic:nvPicPr>
-                    <pic:cNvPr descr="Dashboard vista 2" id="0" name="image1.jpg"/>
+                    <pic:cNvPr descr="Dashboard vista 2" id="0" name="image3.jpg"/>
                     <pic:cNvPicPr preferRelativeResize="0"/>
                   </pic:nvPicPr>
                   <pic:blipFill>
@@ -14116,12 +14116,12 @@
           <wp:inline distB="0" distT="0" distL="0" distR="0">
             <wp:extent cx="5610225" cy="2676525"/>
             <wp:effectExtent b="0" l="0" r="0" t="0"/>
-            <wp:docPr id="4" name="image4.png"/>
+            <wp:docPr id="4" name="image6.png"/>
             <a:graphic>
               <a:graphicData uri="http://schemas.openxmlformats.org/drawingml/2006/picture">
                 <pic:pic>
                   <pic:nvPicPr>
-                    <pic:cNvPr id="0" name="image4.png"/>
+                    <pic:cNvPr id="0" name="image6.png"/>
                     <pic:cNvPicPr preferRelativeResize="0"/>
                   </pic:nvPicPr>
                   <pic:blipFill>
@@ -14240,12 +14240,12 @@
           <wp:inline distB="0" distT="0" distL="0" distR="0">
             <wp:extent cx="5600700" cy="2724150"/>
             <wp:effectExtent b="0" l="0" r="0" t="0"/>
-            <wp:docPr id="7" name="image5.png"/>
+            <wp:docPr id="7" name="image19.png"/>
             <a:graphic>
               <a:graphicData uri="http://schemas.openxmlformats.org/drawingml/2006/picture">
                 <pic:pic>
                   <pic:nvPicPr>
-                    <pic:cNvPr id="0" name="image5.png"/>
+                    <pic:cNvPr id="0" name="image19.png"/>
                     <pic:cNvPicPr preferRelativeResize="0"/>
                   </pic:nvPicPr>
                   <pic:blipFill>
@@ -14375,12 +14375,12 @@
           <wp:inline distB="0" distT="0" distL="0" distR="0">
             <wp:extent cx="5715952" cy="2173809"/>
             <wp:effectExtent b="0" l="0" r="0" t="0"/>
-            <wp:docPr id="6" name="image3.png"/>
+            <wp:docPr id="6" name="image5.png"/>
             <a:graphic>
               <a:graphicData uri="http://schemas.openxmlformats.org/drawingml/2006/picture">
                 <pic:pic>
                   <pic:nvPicPr>
-                    <pic:cNvPr id="0" name="image3.png"/>
+                    <pic:cNvPr id="0" name="image5.png"/>
                     <pic:cNvPicPr preferRelativeResize="0"/>
                   </pic:nvPicPr>
                   <pic:blipFill>
@@ -14499,12 +14499,12 @@
           <wp:inline distB="0" distT="0" distL="0" distR="0">
             <wp:extent cx="5610225" cy="2581275"/>
             <wp:effectExtent b="0" l="0" r="0" t="0"/>
-            <wp:docPr id="9" name="image2.png"/>
+            <wp:docPr id="9" name="image17.png"/>
             <a:graphic>
               <a:graphicData uri="http://schemas.openxmlformats.org/drawingml/2006/picture">
                 <pic:pic>
                   <pic:nvPicPr>
-                    <pic:cNvPr id="0" name="image2.png"/>
+                    <pic:cNvPr id="0" name="image17.png"/>
                     <pic:cNvPicPr preferRelativeResize="0"/>
                   </pic:nvPicPr>
                   <pic:blipFill>
@@ -14747,12 +14747,12 @@
           <wp:inline distB="0" distT="0" distL="0" distR="0">
             <wp:extent cx="5610225" cy="2228850"/>
             <wp:effectExtent b="0" l="0" r="0" t="0"/>
-            <wp:docPr id="11" name="image18.png"/>
+            <wp:docPr id="11" name="image14.png"/>
             <a:graphic>
               <a:graphicData uri="http://schemas.openxmlformats.org/drawingml/2006/picture">
                 <pic:pic>
                   <pic:nvPicPr>
-                    <pic:cNvPr id="0" name="image18.png"/>
+                    <pic:cNvPr id="0" name="image14.png"/>
                     <pic:cNvPicPr preferRelativeResize="0"/>
                   </pic:nvPicPr>
                   <pic:blipFill>
@@ -15006,12 +15006,12 @@
           <wp:inline distB="0" distT="0" distL="0" distR="0">
             <wp:extent cx="5600700" cy="2295525"/>
             <wp:effectExtent b="0" l="0" r="0" t="0"/>
-            <wp:docPr id="14" name="image17.png"/>
+            <wp:docPr id="14" name="image1.png"/>
             <a:graphic>
               <a:graphicData uri="http://schemas.openxmlformats.org/drawingml/2006/picture">
                 <pic:pic>
                   <pic:nvPicPr>
-                    <pic:cNvPr id="0" name="image17.png"/>
+                    <pic:cNvPr id="0" name="image1.png"/>
                     <pic:cNvPicPr preferRelativeResize="0"/>
                   </pic:nvPicPr>
                   <pic:blipFill>
@@ -15806,12 +15806,12 @@
           <wp:inline distB="114300" distT="114300" distL="114300" distR="114300">
             <wp:extent cx="5477827" cy="3619500"/>
             <wp:effectExtent b="0" l="0" r="0" t="0"/>
-            <wp:docPr id="13" name="image15.png"/>
+            <wp:docPr id="13" name="image18.png"/>
             <a:graphic>
               <a:graphicData uri="http://schemas.openxmlformats.org/drawingml/2006/picture">
                 <pic:pic>
                   <pic:nvPicPr>
-                    <pic:cNvPr id="0" name="image15.png"/>
+                    <pic:cNvPr id="0" name="image18.png"/>
                     <pic:cNvPicPr preferRelativeResize="0"/>
                   </pic:nvPicPr>
                   <pic:blipFill>
@@ -15931,12 +15931,12 @@
           <wp:inline distB="114300" distT="114300" distL="114300" distR="114300">
             <wp:extent cx="5612130" cy="3111500"/>
             <wp:effectExtent b="0" l="0" r="0" t="0"/>
-            <wp:docPr id="15" name="image11.png"/>
+            <wp:docPr id="15" name="image2.png"/>
             <a:graphic>
               <a:graphicData uri="http://schemas.openxmlformats.org/drawingml/2006/picture">
                 <pic:pic>
                   <pic:nvPicPr>
-                    <pic:cNvPr id="0" name="image11.png"/>
+                    <pic:cNvPr id="0" name="image2.png"/>
                     <pic:cNvPicPr preferRelativeResize="0"/>
                   </pic:nvPicPr>
                   <pic:blipFill>
@@ -16056,12 +16056,12 @@
           <wp:inline distB="114300" distT="114300" distL="114300" distR="114300">
             <wp:extent cx="5612130" cy="4889500"/>
             <wp:effectExtent b="0" l="0" r="0" t="0"/>
-            <wp:docPr id="16" name="image13.png"/>
+            <wp:docPr id="16" name="image8.png"/>
             <a:graphic>
               <a:graphicData uri="http://schemas.openxmlformats.org/drawingml/2006/picture">
                 <pic:pic>
                   <pic:nvPicPr>
-                    <pic:cNvPr id="0" name="image13.png"/>
+                    <pic:cNvPr id="0" name="image8.png"/>
                     <pic:cNvPicPr preferRelativeResize="0"/>
                   </pic:nvPicPr>
                   <pic:blipFill>
@@ -16181,12 +16181,12 @@
           <wp:inline distB="114300" distT="114300" distL="114300" distR="114300">
             <wp:extent cx="6190382" cy="3442315"/>
             <wp:effectExtent b="0" l="0" r="0" t="0"/>
-            <wp:docPr id="17" name="image8.png"/>
+            <wp:docPr id="17" name="image9.png"/>
             <a:graphic>
               <a:graphicData uri="http://schemas.openxmlformats.org/drawingml/2006/picture">
                 <pic:pic>
                   <pic:nvPicPr>
-                    <pic:cNvPr id="0" name="image8.png"/>
+                    <pic:cNvPr id="0" name="image9.png"/>
                     <pic:cNvPicPr preferRelativeResize="0"/>
                   </pic:nvPicPr>
                   <pic:blipFill>
@@ -16304,12 +16304,12 @@
           <wp:inline distB="114300" distT="114300" distL="114300" distR="114300">
             <wp:extent cx="6433806" cy="2942817"/>
             <wp:effectExtent b="0" l="0" r="0" t="0"/>
-            <wp:docPr id="1" name="image9.png"/>
+            <wp:docPr id="1" name="image4.png"/>
             <a:graphic>
               <a:graphicData uri="http://schemas.openxmlformats.org/drawingml/2006/picture">
                 <pic:pic>
                   <pic:nvPicPr>
-                    <pic:cNvPr id="0" name="image9.png"/>
+                    <pic:cNvPr id="0" name="image4.png"/>
                     <pic:cNvPicPr preferRelativeResize="0"/>
                   </pic:nvPicPr>
                   <pic:blipFill>
@@ -16716,12 +16716,12 @@
           <wp:inline distB="114300" distT="114300" distL="114300" distR="114300">
             <wp:extent cx="5612130" cy="2959100"/>
             <wp:effectExtent b="0" l="0" r="0" t="0"/>
-            <wp:docPr id="18" name="image14.png"/>
+            <wp:docPr id="18" name="image15.png"/>
             <a:graphic>
               <a:graphicData uri="http://schemas.openxmlformats.org/drawingml/2006/picture">
                 <pic:pic>
                   <pic:nvPicPr>
-                    <pic:cNvPr id="0" name="image14.png"/>
+                    <pic:cNvPr id="0" name="image15.png"/>
                     <pic:cNvPicPr preferRelativeResize="0"/>
                   </pic:nvPicPr>
                   <pic:blipFill>
@@ -16800,12 +16800,12 @@
           <wp:inline distB="114300" distT="114300" distL="114300" distR="114300">
             <wp:extent cx="5612130" cy="4292600"/>
             <wp:effectExtent b="0" l="0" r="0" t="0"/>
-            <wp:docPr id="19" name="image10.png"/>
+            <wp:docPr id="19" name="image13.png"/>
             <a:graphic>
               <a:graphicData uri="http://schemas.openxmlformats.org/drawingml/2006/picture">
                 <pic:pic>
                   <pic:nvPicPr>
-                    <pic:cNvPr id="0" name="image10.png"/>
+                    <pic:cNvPr id="0" name="image13.png"/>
                     <pic:cNvPicPr preferRelativeResize="0"/>
                   </pic:nvPicPr>
                   <pic:blipFill>
@@ -22099,12 +22099,12 @@
           <wp:extent cx="4752975" cy="922020"/>
           <wp:effectExtent b="0" l="0" r="0" t="0"/>
           <wp:wrapSquare wrapText="bothSides" distB="0" distT="0" distL="114300" distR="114300"/>
-          <wp:docPr id="2" name="image6.png"/>
+          <wp:docPr id="2" name="image10.png"/>
           <a:graphic>
             <a:graphicData uri="http://schemas.openxmlformats.org/drawingml/2006/picture">
               <pic:pic>
                 <pic:nvPicPr>
-                  <pic:cNvPr id="0" name="image6.png"/>
+                  <pic:cNvPr id="0" name="image10.png"/>
                   <pic:cNvPicPr preferRelativeResize="0"/>
                 </pic:nvPicPr>
                 <pic:blipFill>

</xml_diff>